<commit_message>
DVR: byg Option på Maj-Britts Kontrakt-version og tilpas henvisninger
- Kontrakt: erstattet med Maj-Britts version med hendes sporede ændringer
  (definition af Option, punkt 3.1, 5.3.1, nyt 6.2/6.3 og nyt 15.3).
  Eneste tilføjelse oven på: sætning i 15.3 om tillæg til vedligeholdelse
  og support. Krydshenvisninger er REF-felter og opdateres i Word.
- Bilag 3A, 12, 01, 14 og Udbudsbetingelser: henvisninger rettet til
  hendes nummerering (punkt 6.2 og 6.3 for Optionen, 15.3 for vederlag).
- Bilag 09 og Bilag 12: "Kontraktens punkt 15.3" (bestillingsydelser)
  rettet til 15.4 som følge af hendes nye punkt 15.3.

Co-Authored-By: Claude Fable 5.1 <noreply@anthropic.com>
Claude-Session: https://claude.ai/code/session_011976vgLmukizxh8qCBktF4
</commit_message>
<xml_diff>
--- a/Stjernekort/testdata/dvr/09. Bilag 03A_Kravspecifikation.docx
+++ b/Stjernekort/testdata/dvr/09. Bilag 03A_Kravspecifikation.docx
@@ -3916,7 +3916,7 @@
           <w:rPr>
             <w:b/>
           </w:rPr>
-          <w:t xml:space="preserve">DVR online udbydes som en Option, jf. Kontraktens punkt 6.2. Kravene til Optionen fremgår af afsnit 2.1, 2.3 og 3.5 og prissættes særskilt i bilag 12, Appendiks A, punkt 8.</w:t>
+          <w:t xml:space="preserve">DVR online udbydes som en Option, jf. Kontraktens punkt 6.2 og 6.3. Kravene til Optionen fremgår af afsnit 2.1, 2.3 og 3.5 og prissættes særskilt i bilag 12, Appendiks A, punkt 8.</w:t>
         </w:r>
       </w:ins>
     </w:p>
@@ -7366,7 +7366,7 @@
       </w:pPr>
       <w:ins w:id="1113" w:author="Claude" w:date="2026-09-29T12:00:00Z">
         <w:r>
-          <w:t xml:space="preserve">Kravene i dette afsnit er omfattet af Optionen, jf. Kontraktens punkt 6.2, og prissættes særskilt i bilag 12, Appendiks A, punkt 8. Kravene besvares i Kravmatrixen på samme måde som Kravspecifikationens øvrige krav, uanset om Kunden udnytter Optionen.</w:t>
+          <w:t xml:space="preserve">Kravene i dette afsnit er omfattet af Optionen, jf. Kontraktens punkt 6.2 og 6.3, og prissættes særskilt i bilag 12, Appendiks A, punkt 8. Kravene besvares i Kravmatrixen på samme måde som Kravspecifikationens øvrige krav, uanset om Kunden udnytter Optionen.</w:t>
         </w:r>
       </w:ins>
     </w:p>
@@ -12615,7 +12615,7 @@
                   <w:sz w:val="18"/>
                   <w:szCs w:val="18"/>
                 </w:rPr>
-                <w:t xml:space="preserve">Kundens ret, men ikke pligt, til at bestille udvikling og levering af DVR online, jf. Kontraktens punkt 6.2 og afsnit 3.5 i denne kravspecifikation.</w:t>
+                <w:t xml:space="preserve">Kundens ret, men ikke pligt, til at bestille udvikling og levering af DVR online, jf. Kontraktens punkt 6.2 og 6.3 samt afsnit 3.5 i denne kravspecifikation.</w:t>
               </w:r>
             </w:ins>
           </w:p>

</xml_diff>